<commit_message>
feat: conferencia fiscal por padrao de tributacao, exportacao PDF/Excel e atalhos de navegacao
</commit_message>
<xml_diff>
--- a/docs/Como fazer a Exportação Correta (Backup).docx
+++ b/docs/Como fazer a Exportação Correta (Backup).docx
@@ -50,7 +50,7 @@
     <w:p>
       <w:r>
         <w:pict w14:anchorId="01BF71BA">
-          <v:rect id="_x0000_i1049" style="width:500.55pt;height:.75pt" o:hrpct="0" o:hralign="center" o:hrstd="t" o:hr="t" fillcolor="#a0a0a0" stroked="f"/>
+          <v:rect id="_x0000_i1025" style="width:500.55pt;height:.75pt" o:hrpct="0" o:hralign="center" o:hrstd="t" o:hr="t" fillcolor="#a0a0a0" stroked="f"/>
         </w:pict>
       </w:r>
     </w:p>
@@ -125,7 +125,7 @@
     <w:p>
       <w:r>
         <w:pict w14:anchorId="287AAC09">
-          <v:rect id="_x0000_i1050" style="width:500.55pt;height:.75pt" o:hrpct="0" o:hralign="center" o:hrstd="t" o:hr="t" fillcolor="#a0a0a0" stroked="f"/>
+          <v:rect id="_x0000_i1026" style="width:500.55pt;height:.75pt" o:hrpct="0" o:hralign="center" o:hrstd="t" o:hr="t" fillcolor="#a0a0a0" stroked="f"/>
         </w:pict>
       </w:r>
     </w:p>
@@ -532,7 +532,7 @@
     <w:p>
       <w:r>
         <w:pict w14:anchorId="0526A958">
-          <v:rect id="_x0000_i1051" style="width:500.55pt;height:.75pt" o:hrpct="0" o:hralign="center" o:hrstd="t" o:hr="t" fillcolor="#a0a0a0" stroked="f"/>
+          <v:rect id="_x0000_i1027" style="width:500.55pt;height:.75pt" o:hrpct="0" o:hralign="center" o:hrstd="t" o:hr="t" fillcolor="#a0a0a0" stroked="f"/>
         </w:pict>
       </w:r>
     </w:p>
@@ -598,7 +598,7 @@
     <w:p>
       <w:r>
         <w:pict w14:anchorId="373B57CE">
-          <v:rect id="_x0000_i1052" style="width:500.55pt;height:.75pt" o:hrpct="0" o:hralign="center" o:hrstd="t" o:hr="t" fillcolor="#a0a0a0" stroked="f"/>
+          <v:rect id="_x0000_i1028" style="width:500.55pt;height:.75pt" o:hrpct="0" o:hralign="center" o:hrstd="t" o:hr="t" fillcolor="#a0a0a0" stroked="f"/>
         </w:pict>
       </w:r>
     </w:p>
@@ -653,6 +653,763 @@
         <w:t>Isso varrerá todas as tabelas e corrigirá automaticamente qualquer falta de PRIMARY KEY ou AUTO_INCREMENT.</w:t>
       </w:r>
     </w:p>
+    <w:p>
+      <w:pPr>
+        <w:pBdr>
+          <w:bottom w:val="single" w:sz="6" w:space="1" w:color="auto"/>
+        </w:pBdr>
+      </w:pPr>
+    </w:p>
+    <w:p/>
+    <w:p>
+      <w:r>
+        <w:t>Você estava coberto de razão! Analisei seu banco de dados local e </w:t>
+      </w:r>
+      <w:r>
+        <w:rPr>
+          <w:b/>
+          <w:bCs/>
+        </w:rPr>
+        <w:t>todas as 203 tabelas</w:t>
+      </w:r>
+      <w:r>
+        <w:t> haviam perdido a propriedade AUTO_INCREMENT durante a restauração.</w:t>
+      </w:r>
+    </w:p>
+    <w:p/>
+    <w:p>
+      <w:r>
+        <w:rPr>
+          <w:rFonts w:ascii="Segoe UI Emoji" w:hAnsi="Segoe UI Emoji" w:cs="Segoe UI Emoji"/>
+        </w:rPr>
+        <w:t>🎉</w:t>
+      </w:r>
+      <w:r>
+        <w:t xml:space="preserve"> Primeira Boa Notícia: Seu banco local já está 100% corrigido!</w:t>
+      </w:r>
+    </w:p>
+    <w:p>
+      <w:r>
+        <w:t>Para você não ter o trabalho enorme de marcar tabela por tabela novamente, executei um script de varredura que recalculou o último ID de cada tabela e </w:t>
+      </w:r>
+      <w:r>
+        <w:rPr>
+          <w:b/>
+          <w:bCs/>
+        </w:rPr>
+        <w:t>reativou o AUTO_INCREMENT em todas as 203 tabelas automaticamente</w:t>
+      </w:r>
+      <w:r>
+        <w:t>.</w:t>
+      </w:r>
+    </w:p>
+    <w:p>
+      <w:r>
+        <w:lastRenderedPageBreak/>
+        <w:t>O banco local já está 100% funcional e pronto para uso sem erros de chave primária duplicada!</w:t>
+      </w:r>
+    </w:p>
+    <w:p/>
+    <w:p>
+      <w:r>
+        <w:rPr>
+          <w:rFonts w:ascii="Segoe UI Emoji" w:hAnsi="Segoe UI Emoji" w:cs="Segoe UI Emoji"/>
+        </w:rPr>
+        <w:t>❓</w:t>
+      </w:r>
+      <w:r>
+        <w:t xml:space="preserve"> Por que esse problema acontece ao restaurar o banco?</w:t>
+      </w:r>
+    </w:p>
+    <w:p>
+      <w:r>
+        <w:t>No </w:t>
+      </w:r>
+      <w:proofErr w:type="spellStart"/>
+      <w:r>
+        <w:rPr>
+          <w:b/>
+          <w:bCs/>
+        </w:rPr>
+        <w:t>phpMyAdmin</w:t>
+      </w:r>
+      <w:proofErr w:type="spellEnd"/>
+      <w:r>
+        <w:t xml:space="preserve"> (tanto na </w:t>
+      </w:r>
+      <w:proofErr w:type="spellStart"/>
+      <w:r>
+        <w:t>Hostinger</w:t>
+      </w:r>
+      <w:proofErr w:type="spellEnd"/>
+      <w:r>
+        <w:t xml:space="preserve"> quanto no XAMPP):</w:t>
+      </w:r>
+    </w:p>
+    <w:p>
+      <w:pPr>
+        <w:numPr>
+          <w:ilvl w:val="0"/>
+          <w:numId w:val="9"/>
+        </w:numPr>
+      </w:pPr>
+      <w:r>
+        <w:rPr>
+          <w:b/>
+          <w:bCs/>
+        </w:rPr>
+        <w:t>Estrutura separada:</w:t>
+      </w:r>
+      <w:r>
+        <w:t xml:space="preserve"> Por padrão, o </w:t>
+      </w:r>
+      <w:proofErr w:type="spellStart"/>
+      <w:r>
+        <w:t>phpMyAdmin</w:t>
+      </w:r>
+      <w:proofErr w:type="spellEnd"/>
+      <w:r>
+        <w:t xml:space="preserve"> cria o CREATE TABLE no início do arquivo .</w:t>
+      </w:r>
+      <w:proofErr w:type="spellStart"/>
+      <w:r>
+        <w:t>sql</w:t>
+      </w:r>
+      <w:proofErr w:type="spellEnd"/>
+      <w:r>
+        <w:t> apenas com as colunas, e joga todos os comandos de AUTO_INCREMENT em instruções ALTER TABLE lá no </w:t>
+      </w:r>
+      <w:r>
+        <w:rPr>
+          <w:b/>
+          <w:bCs/>
+        </w:rPr>
+        <w:t>finalzinho do arquivo</w:t>
+      </w:r>
+      <w:r>
+        <w:t>.</w:t>
+      </w:r>
+    </w:p>
+    <w:p>
+      <w:pPr>
+        <w:numPr>
+          <w:ilvl w:val="0"/>
+          <w:numId w:val="9"/>
+        </w:numPr>
+      </w:pPr>
+      <w:r>
+        <w:rPr>
+          <w:b/>
+          <w:bCs/>
+        </w:rPr>
+        <w:t>Estouro de tempo (Timeout):</w:t>
+      </w:r>
+      <w:r>
+        <w:t> Quando você importa um arquivo grande pelo navegador (aba </w:t>
+      </w:r>
+      <w:r>
+        <w:rPr>
+          <w:i/>
+          <w:iCs/>
+        </w:rPr>
+        <w:t>Importar</w:t>
+      </w:r>
+      <w:r>
+        <w:t xml:space="preserve"> do </w:t>
+      </w:r>
+      <w:proofErr w:type="spellStart"/>
+      <w:r>
+        <w:t>phpMyAdmin</w:t>
+      </w:r>
+      <w:proofErr w:type="spellEnd"/>
+      <w:r>
+        <w:t xml:space="preserve">), o servidor web tem um limite de tempo (geralmente 60 a 300 segundos). O </w:t>
+      </w:r>
+      <w:proofErr w:type="spellStart"/>
+      <w:r>
+        <w:t>phpMyAdmin</w:t>
+      </w:r>
+      <w:proofErr w:type="spellEnd"/>
+      <w:r>
+        <w:t xml:space="preserve"> cria as tabelas, insere milhares de registros e, antes de conseguir ler os comandos do final do arquivo, </w:t>
+      </w:r>
+      <w:r>
+        <w:rPr>
+          <w:b/>
+          <w:bCs/>
+        </w:rPr>
+        <w:t>a importação encerra por limite de tempo ou de memória sem avisar direito</w:t>
+      </w:r>
+      <w:r>
+        <w:t>.</w:t>
+      </w:r>
+    </w:p>
+    <w:p>
+      <w:pPr>
+        <w:numPr>
+          <w:ilvl w:val="0"/>
+          <w:numId w:val="9"/>
+        </w:numPr>
+      </w:pPr>
+      <w:r>
+        <w:rPr>
+          <w:b/>
+          <w:bCs/>
+        </w:rPr>
+        <w:t>Resultado:</w:t>
+      </w:r>
+      <w:r>
+        <w:t> Os dados entram, mas a ativação do AUTO_INCREMENT é cortada pela metade ou nem chega a ser executada.</w:t>
+      </w:r>
+    </w:p>
+    <w:p/>
+    <w:p>
+      <w:r>
+        <w:rPr>
+          <w:rFonts w:ascii="Segoe UI Emoji" w:hAnsi="Segoe UI Emoji" w:cs="Segoe UI Emoji"/>
+        </w:rPr>
+        <w:t>🚀</w:t>
+      </w:r>
+      <w:r>
+        <w:t xml:space="preserve"> Como fazer o Backup e a Restauração perfeitos (sem perder o AUTO_INCREMENT)</w:t>
+      </w:r>
+    </w:p>
+    <w:p>
+      <w:r>
+        <w:t>Você tem duas formas seguras de fazer isso:</w:t>
+      </w:r>
+    </w:p>
+    <w:p>
+      <w:r>
+        <w:t xml:space="preserve">Opção 1: Pelo Terminal SSH da </w:t>
+      </w:r>
+      <w:proofErr w:type="spellStart"/>
+      <w:r>
+        <w:t>Hostinger</w:t>
+      </w:r>
+      <w:proofErr w:type="spellEnd"/>
+      <w:r>
+        <w:t> </w:t>
+      </w:r>
+      <w:r>
+        <w:rPr>
+          <w:i/>
+          <w:iCs/>
+        </w:rPr>
+        <w:t>(Método 100% Recomendado e à prova de falhas)</w:t>
+      </w:r>
+    </w:p>
+    <w:p>
+      <w:r>
+        <w:t>O comando nativo do MySQL (</w:t>
+      </w:r>
+      <w:proofErr w:type="spellStart"/>
+      <w:r>
+        <w:t>mysqldump</w:t>
+      </w:r>
+      <w:proofErr w:type="spellEnd"/>
+      <w:r>
+        <w:t>) embute a instrução de AUTO_INCREMENT diretamente no cabeçalho de cada tabela, garantindo que nada se perca:</w:t>
+      </w:r>
+    </w:p>
+    <w:p>
+      <w:pPr>
+        <w:numPr>
+          <w:ilvl w:val="0"/>
+          <w:numId w:val="10"/>
+        </w:numPr>
+      </w:pPr>
+      <w:r>
+        <w:t xml:space="preserve">Acesse o SSH da sua conta na </w:t>
+      </w:r>
+      <w:proofErr w:type="spellStart"/>
+      <w:r>
+        <w:t>Hostinger</w:t>
+      </w:r>
+      <w:proofErr w:type="spellEnd"/>
+      <w:r>
+        <w:t>.</w:t>
+      </w:r>
+    </w:p>
+    <w:p>
+      <w:pPr>
+        <w:numPr>
+          <w:ilvl w:val="0"/>
+          <w:numId w:val="10"/>
+        </w:numPr>
+      </w:pPr>
+      <w:r>
+        <w:t>Para </w:t>
+      </w:r>
+      <w:r>
+        <w:rPr>
+          <w:b/>
+          <w:bCs/>
+        </w:rPr>
+        <w:t>gerar o backup completo</w:t>
+      </w:r>
+      <w:r>
+        <w:t>:</w:t>
+      </w:r>
+    </w:p>
+    <w:p>
+      <w:proofErr w:type="spellStart"/>
+      <w:r>
+        <w:t>bash</w:t>
+      </w:r>
+      <w:proofErr w:type="spellEnd"/>
+    </w:p>
+    <w:p>
+      <w:proofErr w:type="spellStart"/>
+      <w:r>
+        <w:t>mysqldump</w:t>
+      </w:r>
+      <w:proofErr w:type="spellEnd"/>
+      <w:r>
+        <w:t xml:space="preserve"> -u SEU_USUARIO_BD -p --default-</w:t>
+      </w:r>
+      <w:proofErr w:type="spellStart"/>
+      <w:r>
+        <w:t>character</w:t>
+      </w:r>
+      <w:proofErr w:type="spellEnd"/>
+      <w:r>
+        <w:t xml:space="preserve">-set=utf8mb4 SEU_NOME_BD &gt; </w:t>
+      </w:r>
+      <w:proofErr w:type="spellStart"/>
+      <w:r>
+        <w:t>backup_producao.sql</w:t>
+      </w:r>
+      <w:proofErr w:type="spellEnd"/>
+    </w:p>
+    <w:p>
+      <w:r>
+        <w:rPr>
+          <w:i/>
+          <w:iCs/>
+        </w:rPr>
+        <w:t>(Ele pedirá a senha do banco e gerará um arquivo perfeito)</w:t>
+      </w:r>
+      <w:r>
+        <w:t>.</w:t>
+      </w:r>
+    </w:p>
+    <w:p>
+      <w:pPr>
+        <w:numPr>
+          <w:ilvl w:val="0"/>
+          <w:numId w:val="10"/>
+        </w:numPr>
+      </w:pPr>
+      <w:r>
+        <w:lastRenderedPageBreak/>
+        <w:t>Baixe esse arquivo .</w:t>
+      </w:r>
+      <w:proofErr w:type="spellStart"/>
+      <w:r>
+        <w:t>sql</w:t>
+      </w:r>
+      <w:proofErr w:type="spellEnd"/>
+      <w:r>
+        <w:t> via Gerenciador de Arquivos / FTP para o seu computador.</w:t>
+      </w:r>
+    </w:p>
+    <w:p/>
+    <w:p>
+      <w:r>
+        <w:t xml:space="preserve">Opção 2: Pelo </w:t>
+      </w:r>
+      <w:proofErr w:type="spellStart"/>
+      <w:r>
+        <w:t>phpMyAdmin</w:t>
+      </w:r>
+      <w:proofErr w:type="spellEnd"/>
+      <w:r>
+        <w:t xml:space="preserve"> da </w:t>
+      </w:r>
+      <w:proofErr w:type="spellStart"/>
+      <w:r>
+        <w:t>Hostinger</w:t>
+      </w:r>
+      <w:proofErr w:type="spellEnd"/>
+      <w:r>
+        <w:t> </w:t>
+      </w:r>
+      <w:r>
+        <w:rPr>
+          <w:i/>
+          <w:iCs/>
+        </w:rPr>
+        <w:t>(Configuração Manual Obrigatória)</w:t>
+      </w:r>
+    </w:p>
+    <w:p>
+      <w:r>
+        <w:t xml:space="preserve">Se preferir exportar pela tela visual do </w:t>
+      </w:r>
+      <w:proofErr w:type="spellStart"/>
+      <w:r>
+        <w:t>phpMyAdmin</w:t>
+      </w:r>
+      <w:proofErr w:type="spellEnd"/>
+      <w:r>
+        <w:t>:</w:t>
+      </w:r>
+    </w:p>
+    <w:p>
+      <w:pPr>
+        <w:numPr>
+          <w:ilvl w:val="0"/>
+          <w:numId w:val="11"/>
+        </w:numPr>
+      </w:pPr>
+      <w:r>
+        <w:t xml:space="preserve">Abra o banco no </w:t>
+      </w:r>
+      <w:proofErr w:type="spellStart"/>
+      <w:r>
+        <w:t>phpMyAdmin</w:t>
+      </w:r>
+      <w:proofErr w:type="spellEnd"/>
+      <w:r>
+        <w:t xml:space="preserve"> da </w:t>
+      </w:r>
+      <w:proofErr w:type="spellStart"/>
+      <w:r>
+        <w:t>Hostinger</w:t>
+      </w:r>
+      <w:proofErr w:type="spellEnd"/>
+      <w:r>
+        <w:t>.</w:t>
+      </w:r>
+    </w:p>
+    <w:p>
+      <w:pPr>
+        <w:numPr>
+          <w:ilvl w:val="0"/>
+          <w:numId w:val="11"/>
+        </w:numPr>
+      </w:pPr>
+      <w:r>
+        <w:t xml:space="preserve">Clique na </w:t>
+      </w:r>
+      <w:proofErr w:type="gramStart"/>
+      <w:r>
+        <w:t>aba </w:t>
+      </w:r>
+      <w:r>
+        <w:rPr>
+          <w:b/>
+          <w:bCs/>
+        </w:rPr>
+        <w:t>Exportar</w:t>
+      </w:r>
+      <w:proofErr w:type="gramEnd"/>
+      <w:r>
+        <w:t>.</w:t>
+      </w:r>
+    </w:p>
+    <w:p>
+      <w:pPr>
+        <w:numPr>
+          <w:ilvl w:val="0"/>
+          <w:numId w:val="11"/>
+        </w:numPr>
+      </w:pPr>
+      <w:r>
+        <w:t>Em </w:t>
+      </w:r>
+      <w:r>
+        <w:rPr>
+          <w:i/>
+          <w:iCs/>
+        </w:rPr>
+        <w:t>Método de exportação</w:t>
+      </w:r>
+      <w:r>
+        <w:t>, </w:t>
+      </w:r>
+      <w:r>
+        <w:rPr>
+          <w:b/>
+          <w:bCs/>
+        </w:rPr>
+        <w:t>NÃO</w:t>
+      </w:r>
+      <w:r>
+        <w:t> use "Rápido". Selecione </w:t>
+      </w:r>
+      <w:r>
+        <w:rPr>
+          <w:b/>
+          <w:bCs/>
+        </w:rPr>
+        <w:t>"Personalizado - exibir todas as opções possíveis"</w:t>
+      </w:r>
+      <w:r>
+        <w:t>.</w:t>
+      </w:r>
+    </w:p>
+    <w:p>
+      <w:pPr>
+        <w:numPr>
+          <w:ilvl w:val="0"/>
+          <w:numId w:val="11"/>
+        </w:numPr>
+      </w:pPr>
+      <w:r>
+        <w:t>Em </w:t>
+      </w:r>
+      <w:r>
+        <w:rPr>
+          <w:i/>
+          <w:iCs/>
+        </w:rPr>
+        <w:t>Tabelas</w:t>
+      </w:r>
+      <w:r>
+        <w:t>, clique em </w:t>
+      </w:r>
+      <w:r>
+        <w:rPr>
+          <w:b/>
+          <w:bCs/>
+        </w:rPr>
+        <w:t>Selecionar todas</w:t>
+      </w:r>
+      <w:r>
+        <w:t>.</w:t>
+      </w:r>
+    </w:p>
+    <w:p>
+      <w:pPr>
+        <w:numPr>
+          <w:ilvl w:val="0"/>
+          <w:numId w:val="11"/>
+        </w:numPr>
+      </w:pPr>
+      <w:r>
+        <w:t>Role até a seção </w:t>
+      </w:r>
+      <w:r>
+        <w:rPr>
+          <w:b/>
+          <w:bCs/>
+        </w:rPr>
+        <w:t>Opções de criação de objetos</w:t>
+      </w:r>
+      <w:r>
+        <w:t>:</w:t>
+      </w:r>
+    </w:p>
+    <w:p>
+      <w:pPr>
+        <w:numPr>
+          <w:ilvl w:val="1"/>
+          <w:numId w:val="11"/>
+        </w:numPr>
+      </w:pPr>
+      <w:r>
+        <w:rPr>
+          <w:rFonts w:ascii="Segoe UI Emoji" w:hAnsi="Segoe UI Emoji" w:cs="Segoe UI Emoji"/>
+        </w:rPr>
+        <w:t>✅</w:t>
+      </w:r>
+      <w:r>
+        <w:t xml:space="preserve"> Marque: </w:t>
+      </w:r>
+      <w:r>
+        <w:rPr>
+          <w:b/>
+          <w:bCs/>
+        </w:rPr>
+        <w:t>Adicionar instrução CREATE TABLE</w:t>
+      </w:r>
+    </w:p>
+    <w:p>
+      <w:pPr>
+        <w:numPr>
+          <w:ilvl w:val="1"/>
+          <w:numId w:val="11"/>
+        </w:numPr>
+      </w:pPr>
+      <w:r>
+        <w:rPr>
+          <w:rFonts w:ascii="Segoe UI Emoji" w:hAnsi="Segoe UI Emoji" w:cs="Segoe UI Emoji"/>
+        </w:rPr>
+        <w:t>✅</w:t>
+      </w:r>
+      <w:r>
+        <w:t xml:space="preserve"> Marque com atenção: </w:t>
+      </w:r>
+      <w:r>
+        <w:rPr>
+          <w:b/>
+          <w:bCs/>
+        </w:rPr>
+        <w:t>AUTO_INCREMENT</w:t>
+      </w:r>
+    </w:p>
+    <w:p>
+      <w:pPr>
+        <w:numPr>
+          <w:ilvl w:val="0"/>
+          <w:numId w:val="11"/>
+        </w:numPr>
+      </w:pPr>
+      <w:r>
+        <w:t>Em </w:t>
+      </w:r>
+      <w:r>
+        <w:rPr>
+          <w:i/>
+          <w:iCs/>
+        </w:rPr>
+        <w:t>Formato de saída</w:t>
+      </w:r>
+      <w:r>
+        <w:t>, deixe a compressão em </w:t>
+      </w:r>
+      <w:r>
+        <w:rPr>
+          <w:b/>
+          <w:bCs/>
+        </w:rPr>
+        <w:t>"nenhuma"</w:t>
+      </w:r>
+      <w:r>
+        <w:t> ou </w:t>
+      </w:r>
+      <w:r>
+        <w:rPr>
+          <w:b/>
+          <w:bCs/>
+        </w:rPr>
+        <w:t xml:space="preserve">"compactado com </w:t>
+      </w:r>
+      <w:proofErr w:type="spellStart"/>
+      <w:r>
+        <w:rPr>
+          <w:b/>
+          <w:bCs/>
+        </w:rPr>
+        <w:t>gzip</w:t>
+      </w:r>
+      <w:proofErr w:type="spellEnd"/>
+      <w:r>
+        <w:rPr>
+          <w:b/>
+          <w:bCs/>
+        </w:rPr>
+        <w:t>"</w:t>
+      </w:r>
+      <w:r>
+        <w:t> e clique em </w:t>
+      </w:r>
+      <w:r>
+        <w:rPr>
+          <w:b/>
+          <w:bCs/>
+        </w:rPr>
+        <w:t>Exportar</w:t>
+      </w:r>
+      <w:r>
+        <w:t>.</w:t>
+      </w:r>
+    </w:p>
+    <w:p/>
+    <w:p>
+      <w:r>
+        <w:rPr>
+          <w:rFonts w:ascii="Segoe UI Emoji" w:hAnsi="Segoe UI Emoji" w:cs="Segoe UI Emoji"/>
+        </w:rPr>
+        <w:t>💡</w:t>
+      </w:r>
+      <w:r>
+        <w:t xml:space="preserve"> Dica de Ouro para a Restauração no seu computador (XAMPP):</w:t>
+      </w:r>
+    </w:p>
+    <w:p>
+      <w:r>
+        <w:t>Para restaurar no seu computador sem depender do limite de tempo do navegador, faça a importação direto pelo terminal do Windows:</w:t>
+      </w:r>
+    </w:p>
+    <w:p>
+      <w:pPr>
+        <w:numPr>
+          <w:ilvl w:val="0"/>
+          <w:numId w:val="12"/>
+        </w:numPr>
+      </w:pPr>
+      <w:r>
+        <w:t xml:space="preserve">Abra o </w:t>
+      </w:r>
+      <w:proofErr w:type="spellStart"/>
+      <w:r>
+        <w:t>PowerShell</w:t>
+      </w:r>
+      <w:proofErr w:type="spellEnd"/>
+      <w:r>
+        <w:t xml:space="preserve"> / Prompt de Comando e rode:</w:t>
+      </w:r>
+    </w:p>
+    <w:p>
+      <w:proofErr w:type="spellStart"/>
+      <w:r>
+        <w:t>cmd</w:t>
+      </w:r>
+      <w:proofErr w:type="spellEnd"/>
+    </w:p>
+    <w:p>
+      <w:r>
+        <w:t xml:space="preserve">C:\xampp\mysql\bin\mysql.exe -u root </w:t>
+      </w:r>
+      <w:proofErr w:type="spellStart"/>
+      <w:r>
+        <w:t>erp</w:t>
+      </w:r>
+      <w:proofErr w:type="spellEnd"/>
+      <w:r>
+        <w:t xml:space="preserve"> &lt; "C:\caminho\para\seu\backup.sql"</w:t>
+      </w:r>
+    </w:p>
+    <w:p>
+      <w:r>
+        <w:rPr>
+          <w:i/>
+          <w:iCs/>
+        </w:rPr>
+        <w:t>(Substitua </w:t>
+      </w:r>
+      <w:proofErr w:type="spellStart"/>
+      <w:r>
+        <w:rPr>
+          <w:i/>
+          <w:iCs/>
+        </w:rPr>
+        <w:t>erp</w:t>
+      </w:r>
+      <w:proofErr w:type="spellEnd"/>
+      <w:r>
+        <w:rPr>
+          <w:i/>
+          <w:iCs/>
+        </w:rPr>
+        <w:t> pelo nome do seu banco e o caminho pelo local do arquivo)</w:t>
+      </w:r>
+      <w:r>
+        <w:t>.</w:t>
+      </w:r>
+    </w:p>
+    <w:p>
+      <w:r>
+        <w:t>Dessa forma, o MySQL executa o arquivo de ponta a ponta em poucos segundos, sem nenhum timeout do navegador e mantendo todos os auto incrementos intactos!</w:t>
+      </w:r>
+    </w:p>
+    <w:p/>
+    <w:p/>
+    <w:p/>
+    <w:p/>
     <w:p/>
     <w:sectPr>
       <w:pgSz w:w="11906" w:h="16838"/>
@@ -667,6 +1424,119 @@
 <file path=word/numbering.xml><?xml version="1.0" encoding="utf-8"?>
 <w:numbering xmlns:wpc="http://schemas.microsoft.com/office/word/2010/wordprocessingCanvas" xmlns:cx="http://schemas.microsoft.com/office/drawing/2014/chartex" xmlns:cx1="http://schemas.microsoft.com/office/drawing/2015/9/8/chartex" xmlns:cx2="http://schemas.microsoft.com/office/drawing/2015/10/21/chartex" xmlns:cx3="http://schemas.microsoft.com/office/drawing/2016/5/9/chartex" xmlns:cx4="http://schemas.microsoft.com/office/drawing/2016/5/10/chartex" xmlns:cx5="http://schemas.microsoft.com/office/drawing/2016/5/11/chartex" xmlns:cx6="http://schemas.microsoft.com/office/drawing/2016/5/12/chartex" xmlns:cx7="http://schemas.microsoft.com/office/drawing/2016/5/13/chartex" xmlns:cx8="http://schemas.microsoft.com/office/drawing/2016/5/14/chartex" xmlns:mc="http://schemas.openxmlformats.org/markup-compatibility/2006" xmlns:aink="http://schemas.microsoft.com/office/drawing/2016/ink" xmlns:am3d="http://schemas.microsoft.com/office/drawing/2017/model3d" xmlns:o="urn:schemas-microsoft-com:office:office" xmlns:oel="http://schemas.microsoft.com/office/2019/extlst" xmlns:r="http://schemas.openxmlformats.org/officeDocument/2006/relationships" xmlns:m="http://schemas.openxmlformats.org/officeDocument/2006/math" xmlns:v="urn:schemas-microsoft-com:vml" xmlns:wp14="http://schemas.microsoft.com/office/word/2010/wordprocessingDrawing" xmlns:wp="http://schemas.openxmlformats.org/drawingml/2006/wordprocessingDrawing" xmlns:w10="urn:schemas-microsoft-com:office:word" xmlns:w="http://schemas.openxmlformats.org/wordprocessingml/2006/main" xmlns:w14="http://schemas.microsoft.com/office/word/2010/wordml" xmlns:w15="http://schemas.microsoft.com/office/word/2012/wordml" xmlns:w16cex="http://schemas.microsoft.com/office/word/2018/wordml/cex" xmlns:w16cid="http://schemas.microsoft.com/office/word/2016/wordml/cid" xmlns:w16="http://schemas.microsoft.com/office/word/2018/wordml" xmlns:w16sdtdh="http://schemas.microsoft.com/office/word/2020/wordml/sdtdatahash" xmlns:w16se="http://schemas.microsoft.com/office/word/2015/wordml/symex" xmlns:wpg="http://schemas.microsoft.com/office/word/2010/wordprocessingGroup" xmlns:wpi="http://schemas.microsoft.com/office/word/2010/wordprocessingInk" xmlns:wne="http://schemas.microsoft.com/office/word/2006/wordml" xmlns:wps="http://schemas.microsoft.com/office/word/2010/wordprocessingShape" mc:Ignorable="w14 w15 w16se w16cid w16 w16cex w16sdtdh wp14">
   <w:abstractNum w:abstractNumId="0" w15:restartNumberingAfterBreak="0">
+    <w:nsid w:val="156327F2"/>
+    <w:multiLevelType w:val="multilevel"/>
+    <w:tmpl w:val="7228FEF0"/>
+    <w:lvl w:ilvl="0">
+      <w:start w:val="1"/>
+      <w:numFmt w:val="decimal"/>
+      <w:lvlText w:val="%1."/>
+      <w:lvlJc w:val="left"/>
+      <w:pPr>
+        <w:tabs>
+          <w:tab w:val="num" w:pos="720"/>
+        </w:tabs>
+        <w:ind w:left="720" w:hanging="360"/>
+      </w:pPr>
+    </w:lvl>
+    <w:lvl w:ilvl="1" w:tentative="1">
+      <w:start w:val="1"/>
+      <w:numFmt w:val="decimal"/>
+      <w:lvlText w:val="%2."/>
+      <w:lvlJc w:val="left"/>
+      <w:pPr>
+        <w:tabs>
+          <w:tab w:val="num" w:pos="1440"/>
+        </w:tabs>
+        <w:ind w:left="1440" w:hanging="360"/>
+      </w:pPr>
+    </w:lvl>
+    <w:lvl w:ilvl="2" w:tentative="1">
+      <w:start w:val="1"/>
+      <w:numFmt w:val="decimal"/>
+      <w:lvlText w:val="%3."/>
+      <w:lvlJc w:val="left"/>
+      <w:pPr>
+        <w:tabs>
+          <w:tab w:val="num" w:pos="2160"/>
+        </w:tabs>
+        <w:ind w:left="2160" w:hanging="360"/>
+      </w:pPr>
+    </w:lvl>
+    <w:lvl w:ilvl="3" w:tentative="1">
+      <w:start w:val="1"/>
+      <w:numFmt w:val="decimal"/>
+      <w:lvlText w:val="%4."/>
+      <w:lvlJc w:val="left"/>
+      <w:pPr>
+        <w:tabs>
+          <w:tab w:val="num" w:pos="2880"/>
+        </w:tabs>
+        <w:ind w:left="2880" w:hanging="360"/>
+      </w:pPr>
+    </w:lvl>
+    <w:lvl w:ilvl="4" w:tentative="1">
+      <w:start w:val="1"/>
+      <w:numFmt w:val="decimal"/>
+      <w:lvlText w:val="%5."/>
+      <w:lvlJc w:val="left"/>
+      <w:pPr>
+        <w:tabs>
+          <w:tab w:val="num" w:pos="3600"/>
+        </w:tabs>
+        <w:ind w:left="3600" w:hanging="360"/>
+      </w:pPr>
+    </w:lvl>
+    <w:lvl w:ilvl="5" w:tentative="1">
+      <w:start w:val="1"/>
+      <w:numFmt w:val="decimal"/>
+      <w:lvlText w:val="%6."/>
+      <w:lvlJc w:val="left"/>
+      <w:pPr>
+        <w:tabs>
+          <w:tab w:val="num" w:pos="4320"/>
+        </w:tabs>
+        <w:ind w:left="4320" w:hanging="360"/>
+      </w:pPr>
+    </w:lvl>
+    <w:lvl w:ilvl="6" w:tentative="1">
+      <w:start w:val="1"/>
+      <w:numFmt w:val="decimal"/>
+      <w:lvlText w:val="%7."/>
+      <w:lvlJc w:val="left"/>
+      <w:pPr>
+        <w:tabs>
+          <w:tab w:val="num" w:pos="5040"/>
+        </w:tabs>
+        <w:ind w:left="5040" w:hanging="360"/>
+      </w:pPr>
+    </w:lvl>
+    <w:lvl w:ilvl="7" w:tentative="1">
+      <w:start w:val="1"/>
+      <w:numFmt w:val="decimal"/>
+      <w:lvlText w:val="%8."/>
+      <w:lvlJc w:val="left"/>
+      <w:pPr>
+        <w:tabs>
+          <w:tab w:val="num" w:pos="5760"/>
+        </w:tabs>
+        <w:ind w:left="5760" w:hanging="360"/>
+      </w:pPr>
+    </w:lvl>
+    <w:lvl w:ilvl="8" w:tentative="1">
+      <w:start w:val="1"/>
+      <w:numFmt w:val="decimal"/>
+      <w:lvlText w:val="%9."/>
+      <w:lvlJc w:val="left"/>
+      <w:pPr>
+        <w:tabs>
+          <w:tab w:val="num" w:pos="6480"/>
+        </w:tabs>
+        <w:ind w:left="6480" w:hanging="360"/>
+      </w:pPr>
+    </w:lvl>
+  </w:abstractNum>
+  <w:abstractNum w:abstractNumId="1" w15:restartNumberingAfterBreak="0">
     <w:nsid w:val="1B9C5597"/>
     <w:multiLevelType w:val="multilevel"/>
     <w:tmpl w:val="7EF6235E"/>
@@ -783,7 +1653,7 @@
       </w:pPr>
     </w:lvl>
   </w:abstractNum>
-  <w:abstractNum w:abstractNumId="1" w15:restartNumberingAfterBreak="0">
+  <w:abstractNum w:abstractNumId="2" w15:restartNumberingAfterBreak="0">
     <w:nsid w:val="1E056B9D"/>
     <w:multiLevelType w:val="multilevel"/>
     <w:tmpl w:val="6568A820"/>
@@ -932,7 +1802,7 @@
       </w:rPr>
     </w:lvl>
   </w:abstractNum>
-  <w:abstractNum w:abstractNumId="2" w15:restartNumberingAfterBreak="0">
+  <w:abstractNum w:abstractNumId="3" w15:restartNumberingAfterBreak="0">
     <w:nsid w:val="216D02E9"/>
     <w:multiLevelType w:val="multilevel"/>
     <w:tmpl w:val="AEE06CE0"/>
@@ -1081,7 +1951,120 @@
       </w:rPr>
     </w:lvl>
   </w:abstractNum>
-  <w:abstractNum w:abstractNumId="3" w15:restartNumberingAfterBreak="0">
+  <w:abstractNum w:abstractNumId="4" w15:restartNumberingAfterBreak="0">
+    <w:nsid w:val="276173D3"/>
+    <w:multiLevelType w:val="multilevel"/>
+    <w:tmpl w:val="6CE4F036"/>
+    <w:lvl w:ilvl="0">
+      <w:start w:val="1"/>
+      <w:numFmt w:val="decimal"/>
+      <w:lvlText w:val="%1."/>
+      <w:lvlJc w:val="left"/>
+      <w:pPr>
+        <w:tabs>
+          <w:tab w:val="num" w:pos="720"/>
+        </w:tabs>
+        <w:ind w:left="720" w:hanging="360"/>
+      </w:pPr>
+    </w:lvl>
+    <w:lvl w:ilvl="1" w:tentative="1">
+      <w:start w:val="1"/>
+      <w:numFmt w:val="decimal"/>
+      <w:lvlText w:val="%2."/>
+      <w:lvlJc w:val="left"/>
+      <w:pPr>
+        <w:tabs>
+          <w:tab w:val="num" w:pos="1440"/>
+        </w:tabs>
+        <w:ind w:left="1440" w:hanging="360"/>
+      </w:pPr>
+    </w:lvl>
+    <w:lvl w:ilvl="2" w:tentative="1">
+      <w:start w:val="1"/>
+      <w:numFmt w:val="decimal"/>
+      <w:lvlText w:val="%3."/>
+      <w:lvlJc w:val="left"/>
+      <w:pPr>
+        <w:tabs>
+          <w:tab w:val="num" w:pos="2160"/>
+        </w:tabs>
+        <w:ind w:left="2160" w:hanging="360"/>
+      </w:pPr>
+    </w:lvl>
+    <w:lvl w:ilvl="3" w:tentative="1">
+      <w:start w:val="1"/>
+      <w:numFmt w:val="decimal"/>
+      <w:lvlText w:val="%4."/>
+      <w:lvlJc w:val="left"/>
+      <w:pPr>
+        <w:tabs>
+          <w:tab w:val="num" w:pos="2880"/>
+        </w:tabs>
+        <w:ind w:left="2880" w:hanging="360"/>
+      </w:pPr>
+    </w:lvl>
+    <w:lvl w:ilvl="4" w:tentative="1">
+      <w:start w:val="1"/>
+      <w:numFmt w:val="decimal"/>
+      <w:lvlText w:val="%5."/>
+      <w:lvlJc w:val="left"/>
+      <w:pPr>
+        <w:tabs>
+          <w:tab w:val="num" w:pos="3600"/>
+        </w:tabs>
+        <w:ind w:left="3600" w:hanging="360"/>
+      </w:pPr>
+    </w:lvl>
+    <w:lvl w:ilvl="5" w:tentative="1">
+      <w:start w:val="1"/>
+      <w:numFmt w:val="decimal"/>
+      <w:lvlText w:val="%6."/>
+      <w:lvlJc w:val="left"/>
+      <w:pPr>
+        <w:tabs>
+          <w:tab w:val="num" w:pos="4320"/>
+        </w:tabs>
+        <w:ind w:left="4320" w:hanging="360"/>
+      </w:pPr>
+    </w:lvl>
+    <w:lvl w:ilvl="6" w:tentative="1">
+      <w:start w:val="1"/>
+      <w:numFmt w:val="decimal"/>
+      <w:lvlText w:val="%7."/>
+      <w:lvlJc w:val="left"/>
+      <w:pPr>
+        <w:tabs>
+          <w:tab w:val="num" w:pos="5040"/>
+        </w:tabs>
+        <w:ind w:left="5040" w:hanging="360"/>
+      </w:pPr>
+    </w:lvl>
+    <w:lvl w:ilvl="7" w:tentative="1">
+      <w:start w:val="1"/>
+      <w:numFmt w:val="decimal"/>
+      <w:lvlText w:val="%8."/>
+      <w:lvlJc w:val="left"/>
+      <w:pPr>
+        <w:tabs>
+          <w:tab w:val="num" w:pos="5760"/>
+        </w:tabs>
+        <w:ind w:left="5760" w:hanging="360"/>
+      </w:pPr>
+    </w:lvl>
+    <w:lvl w:ilvl="8" w:tentative="1">
+      <w:start w:val="1"/>
+      <w:numFmt w:val="decimal"/>
+      <w:lvlText w:val="%9."/>
+      <w:lvlJc w:val="left"/>
+      <w:pPr>
+        <w:tabs>
+          <w:tab w:val="num" w:pos="6480"/>
+        </w:tabs>
+        <w:ind w:left="6480" w:hanging="360"/>
+      </w:pPr>
+    </w:lvl>
+  </w:abstractNum>
+  <w:abstractNum w:abstractNumId="5" w15:restartNumberingAfterBreak="0">
     <w:nsid w:val="2CBD0DE5"/>
     <w:multiLevelType w:val="multilevel"/>
     <w:tmpl w:val="65D2B406"/>
@@ -1194,7 +2177,7 @@
       </w:pPr>
     </w:lvl>
   </w:abstractNum>
-  <w:abstractNum w:abstractNumId="4" w15:restartNumberingAfterBreak="0">
+  <w:abstractNum w:abstractNumId="6" w15:restartNumberingAfterBreak="0">
     <w:nsid w:val="505765C9"/>
     <w:multiLevelType w:val="multilevel"/>
     <w:tmpl w:val="1F30F75C"/>
@@ -1311,7 +2294,7 @@
       </w:pPr>
     </w:lvl>
   </w:abstractNum>
-  <w:abstractNum w:abstractNumId="5" w15:restartNumberingAfterBreak="0">
+  <w:abstractNum w:abstractNumId="7" w15:restartNumberingAfterBreak="0">
     <w:nsid w:val="6053157D"/>
     <w:multiLevelType w:val="multilevel"/>
     <w:tmpl w:val="07083AAC"/>
@@ -1460,7 +2443,7 @@
       </w:rPr>
     </w:lvl>
   </w:abstractNum>
-  <w:abstractNum w:abstractNumId="6" w15:restartNumberingAfterBreak="0">
+  <w:abstractNum w:abstractNumId="8" w15:restartNumberingAfterBreak="0">
     <w:nsid w:val="688756D1"/>
     <w:multiLevelType w:val="multilevel"/>
     <w:tmpl w:val="C69613AA"/>
@@ -1609,7 +2592,237 @@
       </w:rPr>
     </w:lvl>
   </w:abstractNum>
-  <w:abstractNum w:abstractNumId="7" w15:restartNumberingAfterBreak="0">
+  <w:abstractNum w:abstractNumId="9" w15:restartNumberingAfterBreak="0">
+    <w:nsid w:val="6F5D1D51"/>
+    <w:multiLevelType w:val="multilevel"/>
+    <w:tmpl w:val="B03C8112"/>
+    <w:lvl w:ilvl="0">
+      <w:start w:val="1"/>
+      <w:numFmt w:val="decimal"/>
+      <w:lvlText w:val="%1."/>
+      <w:lvlJc w:val="left"/>
+      <w:pPr>
+        <w:tabs>
+          <w:tab w:val="num" w:pos="720"/>
+        </w:tabs>
+        <w:ind w:left="720" w:hanging="360"/>
+      </w:pPr>
+    </w:lvl>
+    <w:lvl w:ilvl="1">
+      <w:start w:val="1"/>
+      <w:numFmt w:val="bullet"/>
+      <w:lvlText w:val=""/>
+      <w:lvlJc w:val="left"/>
+      <w:pPr>
+        <w:tabs>
+          <w:tab w:val="num" w:pos="1440"/>
+        </w:tabs>
+        <w:ind w:left="1440" w:hanging="360"/>
+      </w:pPr>
+      <w:rPr>
+        <w:rFonts w:ascii="Symbol" w:hAnsi="Symbol" w:hint="default"/>
+        <w:sz w:val="20"/>
+      </w:rPr>
+    </w:lvl>
+    <w:lvl w:ilvl="2" w:tentative="1">
+      <w:start w:val="1"/>
+      <w:numFmt w:val="decimal"/>
+      <w:lvlText w:val="%3."/>
+      <w:lvlJc w:val="left"/>
+      <w:pPr>
+        <w:tabs>
+          <w:tab w:val="num" w:pos="2160"/>
+        </w:tabs>
+        <w:ind w:left="2160" w:hanging="360"/>
+      </w:pPr>
+    </w:lvl>
+    <w:lvl w:ilvl="3" w:tentative="1">
+      <w:start w:val="1"/>
+      <w:numFmt w:val="decimal"/>
+      <w:lvlText w:val="%4."/>
+      <w:lvlJc w:val="left"/>
+      <w:pPr>
+        <w:tabs>
+          <w:tab w:val="num" w:pos="2880"/>
+        </w:tabs>
+        <w:ind w:left="2880" w:hanging="360"/>
+      </w:pPr>
+    </w:lvl>
+    <w:lvl w:ilvl="4" w:tentative="1">
+      <w:start w:val="1"/>
+      <w:numFmt w:val="decimal"/>
+      <w:lvlText w:val="%5."/>
+      <w:lvlJc w:val="left"/>
+      <w:pPr>
+        <w:tabs>
+          <w:tab w:val="num" w:pos="3600"/>
+        </w:tabs>
+        <w:ind w:left="3600" w:hanging="360"/>
+      </w:pPr>
+    </w:lvl>
+    <w:lvl w:ilvl="5" w:tentative="1">
+      <w:start w:val="1"/>
+      <w:numFmt w:val="decimal"/>
+      <w:lvlText w:val="%6."/>
+      <w:lvlJc w:val="left"/>
+      <w:pPr>
+        <w:tabs>
+          <w:tab w:val="num" w:pos="4320"/>
+        </w:tabs>
+        <w:ind w:left="4320" w:hanging="360"/>
+      </w:pPr>
+    </w:lvl>
+    <w:lvl w:ilvl="6" w:tentative="1">
+      <w:start w:val="1"/>
+      <w:numFmt w:val="decimal"/>
+      <w:lvlText w:val="%7."/>
+      <w:lvlJc w:val="left"/>
+      <w:pPr>
+        <w:tabs>
+          <w:tab w:val="num" w:pos="5040"/>
+        </w:tabs>
+        <w:ind w:left="5040" w:hanging="360"/>
+      </w:pPr>
+    </w:lvl>
+    <w:lvl w:ilvl="7" w:tentative="1">
+      <w:start w:val="1"/>
+      <w:numFmt w:val="decimal"/>
+      <w:lvlText w:val="%8."/>
+      <w:lvlJc w:val="left"/>
+      <w:pPr>
+        <w:tabs>
+          <w:tab w:val="num" w:pos="5760"/>
+        </w:tabs>
+        <w:ind w:left="5760" w:hanging="360"/>
+      </w:pPr>
+    </w:lvl>
+    <w:lvl w:ilvl="8" w:tentative="1">
+      <w:start w:val="1"/>
+      <w:numFmt w:val="decimal"/>
+      <w:lvlText w:val="%9."/>
+      <w:lvlJc w:val="left"/>
+      <w:pPr>
+        <w:tabs>
+          <w:tab w:val="num" w:pos="6480"/>
+        </w:tabs>
+        <w:ind w:left="6480" w:hanging="360"/>
+      </w:pPr>
+    </w:lvl>
+  </w:abstractNum>
+  <w:abstractNum w:abstractNumId="10" w15:restartNumberingAfterBreak="0">
+    <w:nsid w:val="6FDE657A"/>
+    <w:multiLevelType w:val="multilevel"/>
+    <w:tmpl w:val="8C3C6908"/>
+    <w:lvl w:ilvl="0">
+      <w:start w:val="1"/>
+      <w:numFmt w:val="decimal"/>
+      <w:lvlText w:val="%1."/>
+      <w:lvlJc w:val="left"/>
+      <w:pPr>
+        <w:tabs>
+          <w:tab w:val="num" w:pos="720"/>
+        </w:tabs>
+        <w:ind w:left="720" w:hanging="360"/>
+      </w:pPr>
+    </w:lvl>
+    <w:lvl w:ilvl="1" w:tentative="1">
+      <w:start w:val="1"/>
+      <w:numFmt w:val="decimal"/>
+      <w:lvlText w:val="%2."/>
+      <w:lvlJc w:val="left"/>
+      <w:pPr>
+        <w:tabs>
+          <w:tab w:val="num" w:pos="1440"/>
+        </w:tabs>
+        <w:ind w:left="1440" w:hanging="360"/>
+      </w:pPr>
+    </w:lvl>
+    <w:lvl w:ilvl="2" w:tentative="1">
+      <w:start w:val="1"/>
+      <w:numFmt w:val="decimal"/>
+      <w:lvlText w:val="%3."/>
+      <w:lvlJc w:val="left"/>
+      <w:pPr>
+        <w:tabs>
+          <w:tab w:val="num" w:pos="2160"/>
+        </w:tabs>
+        <w:ind w:left="2160" w:hanging="360"/>
+      </w:pPr>
+    </w:lvl>
+    <w:lvl w:ilvl="3" w:tentative="1">
+      <w:start w:val="1"/>
+      <w:numFmt w:val="decimal"/>
+      <w:lvlText w:val="%4."/>
+      <w:lvlJc w:val="left"/>
+      <w:pPr>
+        <w:tabs>
+          <w:tab w:val="num" w:pos="2880"/>
+        </w:tabs>
+        <w:ind w:left="2880" w:hanging="360"/>
+      </w:pPr>
+    </w:lvl>
+    <w:lvl w:ilvl="4" w:tentative="1">
+      <w:start w:val="1"/>
+      <w:numFmt w:val="decimal"/>
+      <w:lvlText w:val="%5."/>
+      <w:lvlJc w:val="left"/>
+      <w:pPr>
+        <w:tabs>
+          <w:tab w:val="num" w:pos="3600"/>
+        </w:tabs>
+        <w:ind w:left="3600" w:hanging="360"/>
+      </w:pPr>
+    </w:lvl>
+    <w:lvl w:ilvl="5" w:tentative="1">
+      <w:start w:val="1"/>
+      <w:numFmt w:val="decimal"/>
+      <w:lvlText w:val="%6."/>
+      <w:lvlJc w:val="left"/>
+      <w:pPr>
+        <w:tabs>
+          <w:tab w:val="num" w:pos="4320"/>
+        </w:tabs>
+        <w:ind w:left="4320" w:hanging="360"/>
+      </w:pPr>
+    </w:lvl>
+    <w:lvl w:ilvl="6" w:tentative="1">
+      <w:start w:val="1"/>
+      <w:numFmt w:val="decimal"/>
+      <w:lvlText w:val="%7."/>
+      <w:lvlJc w:val="left"/>
+      <w:pPr>
+        <w:tabs>
+          <w:tab w:val="num" w:pos="5040"/>
+        </w:tabs>
+        <w:ind w:left="5040" w:hanging="360"/>
+      </w:pPr>
+    </w:lvl>
+    <w:lvl w:ilvl="7" w:tentative="1">
+      <w:start w:val="1"/>
+      <w:numFmt w:val="decimal"/>
+      <w:lvlText w:val="%8."/>
+      <w:lvlJc w:val="left"/>
+      <w:pPr>
+        <w:tabs>
+          <w:tab w:val="num" w:pos="5760"/>
+        </w:tabs>
+        <w:ind w:left="5760" w:hanging="360"/>
+      </w:pPr>
+    </w:lvl>
+    <w:lvl w:ilvl="8" w:tentative="1">
+      <w:start w:val="1"/>
+      <w:numFmt w:val="decimal"/>
+      <w:lvlText w:val="%9."/>
+      <w:lvlJc w:val="left"/>
+      <w:pPr>
+        <w:tabs>
+          <w:tab w:val="num" w:pos="6480"/>
+        </w:tabs>
+        <w:ind w:left="6480" w:hanging="360"/>
+      </w:pPr>
+    </w:lvl>
+  </w:abstractNum>
+  <w:abstractNum w:abstractNumId="11" w15:restartNumberingAfterBreak="0">
     <w:nsid w:val="78E96247"/>
     <w:multiLevelType w:val="multilevel"/>
     <w:tmpl w:val="058C22B6"/>
@@ -1723,28 +2936,40 @@
     </w:lvl>
   </w:abstractNum>
   <w:num w:numId="1" w16cid:durableId="436101792">
+    <w:abstractNumId w:val="3"/>
+  </w:num>
+  <w:num w:numId="2" w16cid:durableId="593897808">
+    <w:abstractNumId w:val="6"/>
+  </w:num>
+  <w:num w:numId="3" w16cid:durableId="750854615">
+    <w:abstractNumId w:val="7"/>
+  </w:num>
+  <w:num w:numId="4" w16cid:durableId="2146000775">
+    <w:abstractNumId w:val="11"/>
+  </w:num>
+  <w:num w:numId="5" w16cid:durableId="1944261062">
+    <w:abstractNumId w:val="8"/>
+  </w:num>
+  <w:num w:numId="6" w16cid:durableId="616647134">
+    <w:abstractNumId w:val="1"/>
+  </w:num>
+  <w:num w:numId="7" w16cid:durableId="997003395">
     <w:abstractNumId w:val="2"/>
   </w:num>
-  <w:num w:numId="2" w16cid:durableId="593897808">
+  <w:num w:numId="8" w16cid:durableId="1768698947">
+    <w:abstractNumId w:val="5"/>
+  </w:num>
+  <w:num w:numId="9" w16cid:durableId="1830632122">
+    <w:abstractNumId w:val="0"/>
+  </w:num>
+  <w:num w:numId="10" w16cid:durableId="30806778">
     <w:abstractNumId w:val="4"/>
   </w:num>
-  <w:num w:numId="3" w16cid:durableId="750854615">
-    <w:abstractNumId w:val="5"/>
+  <w:num w:numId="11" w16cid:durableId="10379883">
+    <w:abstractNumId w:val="9"/>
   </w:num>
-  <w:num w:numId="4" w16cid:durableId="2146000775">
-    <w:abstractNumId w:val="7"/>
-  </w:num>
-  <w:num w:numId="5" w16cid:durableId="1944261062">
-    <w:abstractNumId w:val="6"/>
-  </w:num>
-  <w:num w:numId="6" w16cid:durableId="616647134">
-    <w:abstractNumId w:val="0"/>
-  </w:num>
-  <w:num w:numId="7" w16cid:durableId="997003395">
-    <w:abstractNumId w:val="1"/>
-  </w:num>
-  <w:num w:numId="8" w16cid:durableId="1768698947">
-    <w:abstractNumId w:val="3"/>
+  <w:num w:numId="12" w16cid:durableId="1549949183">
+    <w:abstractNumId w:val="10"/>
   </w:num>
 </w:numbering>
 </file>

</xml_diff>